<commit_message>
fix: polish portfolio details and resume
</commit_message>
<xml_diff>
--- a/public/resume/SeMinKong-Resume.docx
+++ b/public/resume/SeMinKong-Resume.docx
@@ -183,18 +183,12 @@
       </w:pPr>
       <w:r>
         <w:rPr>
-          <w:rFonts w:ascii="Arial" w:cs="Arial" w:eastAsia="Arial" w:hAnsi="Arial"/>
-          <w:color w:val="000000"/>
-          <w:sz w:val="18"/>
-          <w:szCs w:val="18"/>
-          <w:rtl w:val="0"/>
-        </w:rPr>
-        <w:t xml:space="preserve">Software engineering graduate focused on AI and robotics, with hands-on experience integrating computer vision, ROS 2, backend services, and hardware. Builds end-to-end systems spanning model pipelines, real-time control, and user-facing dashboards.</w:t>
-      </w:r>
-      <w:r>
-        <w:rPr>
-          <w:rtl w:val="0"/>
-        </w:rPr>
+          <w:rFonts w:ascii="Arial" w:hAnsi="Arial"/>
+          <w:b w:val="0"/>
+          <w:i w:val="0"/>
+          <w:sz w:val="18"/>
+        </w:rPr>
+        <w:t>Software engineering graduate focused on AI and robotics, with project experience integrating computer vision, ROS 2, backend services, and hardware. Recent team work includes THING, a human-mimetic robot hand connecting 21-point hand perception to guarded seven-axis actuation, live monitoring, and experiment records.</w:t>
       </w:r>
     </w:p>
     <w:p>
@@ -597,30 +591,21 @@
       </w:pPr>
       <w:r>
         <w:rPr>
-          <w:rFonts w:ascii="Arial" w:cs="Arial" w:eastAsia="Arial" w:hAnsi="Arial"/>
-          <w:b w:val="1"/>
-          <w:bCs w:val="1"/>
-          <w:color w:val="000000"/>
-          <w:sz w:val="17"/>
-          <w:szCs w:val="17"/>
-          <w:rtl w:val="0"/>
+          <w:rFonts w:ascii="Arial" w:hAnsi="Arial"/>
+          <w:b/>
+          <w:i w:val="0"/>
+          <w:sz w:val="17"/>
         </w:rPr>
         <w:t xml:space="preserve">AI &amp; Vision: </w:t>
       </w:r>
       <w:r>
         <w:rPr>
-          <w:rFonts w:ascii="Arial" w:cs="Arial" w:eastAsia="Arial" w:hAnsi="Arial"/>
-          <w:color w:val="000000"/>
-          <w:sz w:val="17"/>
-          <w:szCs w:val="17"/>
-          <w:rtl w:val="0"/>
-        </w:rPr>
-        <w:t xml:space="preserve">PyTorch, Ultralytics YOLO, OpenCV, Transformers, CUDA</w:t>
-      </w:r>
-      <w:r>
-        <w:rPr>
-          <w:rtl w:val="0"/>
-        </w:rPr>
+          <w:rFonts w:ascii="Arial" w:hAnsi="Arial"/>
+          <w:b w:val="0"/>
+          <w:i w:val="0"/>
+          <w:sz w:val="17"/>
+        </w:rPr>
+        <w:t>PyTorch, Ultralytics YOLO, MediaPipe Hands, OpenCV, Transformers, CUDA</w:t>
       </w:r>
     </w:p>
     <w:p>
@@ -633,30 +618,21 @@
       </w:pPr>
       <w:r>
         <w:rPr>
-          <w:rFonts w:ascii="Arial" w:cs="Arial" w:eastAsia="Arial" w:hAnsi="Arial"/>
-          <w:b w:val="1"/>
-          <w:bCs w:val="1"/>
-          <w:color w:val="000000"/>
-          <w:sz w:val="17"/>
-          <w:szCs w:val="17"/>
-          <w:rtl w:val="0"/>
+          <w:rFonts w:ascii="Arial" w:hAnsi="Arial"/>
+          <w:b/>
+          <w:i w:val="0"/>
+          <w:sz w:val="17"/>
         </w:rPr>
         <w:t xml:space="preserve">Robotics &amp; Systems: </w:t>
       </w:r>
       <w:r>
         <w:rPr>
-          <w:rFonts w:ascii="Arial" w:cs="Arial" w:eastAsia="Arial" w:hAnsi="Arial"/>
-          <w:color w:val="000000"/>
-          <w:sz w:val="17"/>
-          <w:szCs w:val="17"/>
-          <w:rtl w:val="0"/>
-        </w:rPr>
-        <w:t xml:space="preserve">ROS 2, Intel RealSense, Dobot Magician, RoboDK, NVIDIA Isaac Sim / Isaac Lab</w:t>
-      </w:r>
-      <w:r>
-        <w:rPr>
-          <w:rtl w:val="0"/>
-        </w:rPr>
+          <w:rFonts w:ascii="Arial" w:hAnsi="Arial"/>
+          <w:b w:val="0"/>
+          <w:i w:val="0"/>
+          <w:sz w:val="17"/>
+        </w:rPr>
+        <w:t>ROS 2, DYNAMIXEL XL330, Jetson, Raspberry Pi 5, Intel RealSense, Dobot, Isaac Sim / Isaac Lab</w:t>
       </w:r>
     </w:p>
     <w:p>
@@ -669,30 +645,21 @@
       </w:pPr>
       <w:r>
         <w:rPr>
-          <w:rFonts w:ascii="Arial" w:cs="Arial" w:eastAsia="Arial" w:hAnsi="Arial"/>
-          <w:b w:val="1"/>
-          <w:bCs w:val="1"/>
-          <w:color w:val="000000"/>
-          <w:sz w:val="17"/>
-          <w:szCs w:val="17"/>
-          <w:rtl w:val="0"/>
+          <w:rFonts w:ascii="Arial" w:hAnsi="Arial"/>
+          <w:b/>
+          <w:i w:val="0"/>
+          <w:sz w:val="17"/>
         </w:rPr>
         <w:t xml:space="preserve">Backend &amp; Tools: </w:t>
       </w:r>
       <w:r>
         <w:rPr>
-          <w:rFonts w:ascii="Arial" w:cs="Arial" w:eastAsia="Arial" w:hAnsi="Arial"/>
-          <w:color w:val="000000"/>
-          <w:sz w:val="17"/>
-          <w:szCs w:val="17"/>
-          <w:rtl w:val="0"/>
-        </w:rPr>
-        <w:t xml:space="preserve">FastAPI, WebSocket, React, Node.js, Socket.io, Git, Docker, Linux (Ubuntu)</w:t>
-      </w:r>
-      <w:r>
-        <w:rPr>
-          <w:rtl w:val="0"/>
-        </w:rPr>
+          <w:rFonts w:ascii="Arial" w:hAnsi="Arial"/>
+          <w:b w:val="0"/>
+          <w:i w:val="0"/>
+          <w:sz w:val="17"/>
+        </w:rPr>
+        <w:t>FastAPI, Django, WebSocket, React, Node.js, Socket.io, Git, Docker, Linux (Ubuntu)</w:t>
       </w:r>
     </w:p>
     <w:p>
@@ -1125,66 +1092,31 @@
       </w:pPr>
       <w:r>
         <w:rPr>
-          <w:rFonts w:ascii="Arial" w:cs="Arial" w:eastAsia="Arial" w:hAnsi="Arial"/>
-          <w:b w:val="1"/>
-          <w:bCs w:val="1"/>
-          <w:i w:val="0"/>
-          <w:iCs w:val="0"/>
-          <w:smallCaps w:val="0"/>
-          <w:strike w:val="0"/>
-          <w:color w:val="000000"/>
-          <w:sz w:val="18"/>
-          <w:szCs w:val="18"/>
-          <w:u w:val="none"/>
-          <w:shd w:fill="auto" w:val="clear"/>
-          <w:vertAlign w:val="baseline"/>
-          <w:rtl w:val="0"/>
-        </w:rPr>
-        <w:t xml:space="preserve">AQIS for Smart Factory</w:t>
-      </w:r>
-      <w:r>
-        <w:rPr>
-          <w:rFonts w:ascii="Arial" w:cs="Arial" w:eastAsia="Arial" w:hAnsi="Arial"/>
-          <w:b w:val="0"/>
-          <w:bCs w:val="0"/>
-          <w:i w:val="0"/>
-          <w:iCs w:val="0"/>
-          <w:smallCaps w:val="0"/>
-          <w:strike w:val="0"/>
-          <w:color w:val="000000"/>
-          <w:sz w:val="18"/>
-          <w:szCs w:val="18"/>
-          <w:u w:val="none"/>
-          <w:shd w:fill="auto" w:val="clear"/>
-          <w:vertAlign w:val="baseline"/>
-          <w:rtl w:val="0"/>
-        </w:rPr>
-        <w:t xml:space="preserve"> | Team Lead, Full-Stack &amp; Robot Integration</w:t>
-      </w:r>
-      <w:r>
-        <w:rPr>
-          <w:rFonts w:ascii="Arial" w:cs="Arial" w:eastAsia="Arial" w:hAnsi="Arial"/>
-          <w:b w:val="1"/>
-          <w:bCs w:val="1"/>
-          <w:i w:val="0"/>
-          <w:iCs w:val="0"/>
-          <w:smallCaps w:val="0"/>
-          <w:strike w:val="0"/>
-          <w:color w:val="000000"/>
-          <w:sz w:val="17"/>
-          <w:szCs w:val="17"/>
-          <w:u w:val="none"/>
-          <w:shd w:fill="auto" w:val="clear"/>
-          <w:vertAlign w:val="baseline"/>
-          <w:rtl w:val="0"/>
+          <w:rFonts w:ascii="Arial" w:hAnsi="Arial"/>
+          <w:b/>
+          <w:i w:val="0"/>
+          <w:sz w:val="18"/>
+        </w:rPr>
+        <w:t>THING Human-Mimetic Robot Hand</w:t>
+      </w:r>
+      <w:r>
+        <w:rPr>
+          <w:rFonts w:ascii="Arial" w:hAnsi="Arial"/>
+          <w:b w:val="0"/>
+          <w:i w:val="0"/>
+          <w:sz w:val="18"/>
+        </w:rPr>
+        <w:t xml:space="preserve"> | Team Project, Robotics &amp; Edge AI</w:t>
+      </w:r>
+      <w:r>
+        <w:rPr>
+          <w:rFonts w:ascii="Arial" w:hAnsi="Arial"/>
+          <w:b/>
+          <w:i w:val="0"/>
+          <w:sz w:val="17"/>
         </w:rPr>
         <w:tab/>
-        <w:t xml:space="preserve">May 2026 - Jun 2026</w:t>
-      </w:r>
-      <w:r>
-        <w:rPr>
-          <w:rtl w:val="0"/>
-        </w:rPr>
+        <w:t>2026</w:t>
       </w:r>
     </w:p>
     <w:p>
@@ -1222,49 +1154,25 @@
       </w:pPr>
       <w:r>
         <w:rPr>
-          <w:rFonts w:ascii="Arial" w:cs="Arial" w:eastAsia="Arial" w:hAnsi="Arial"/>
-          <w:b w:val="0"/>
-          <w:bCs w:val="0"/>
-          <w:i w:val="1"/>
-          <w:iCs w:val="1"/>
-          <w:smallCaps w:val="0"/>
-          <w:strike w:val="0"/>
-          <w:color w:val="000000"/>
-          <w:sz w:val="17"/>
-          <w:szCs w:val="17"/>
-          <w:u w:val="none"/>
-          <w:shd w:fill="auto" w:val="clear"/>
-          <w:vertAlign w:val="baseline"/>
-          <w:rtl w:val="0"/>
-        </w:rPr>
-        <w:t xml:space="preserve">ROS 2 | FastAPI | WebSocket | React | RealSense | Dobot | YOLOv5 | </w:t>
-      </w:r>
-      <w:hyperlink r:id="rId9">
+          <w:rFonts w:ascii="Arial" w:hAnsi="Arial"/>
+          <w:b w:val="0"/>
+          <w:i/>
+          <w:sz w:val="17"/>
+        </w:rPr>
+        <w:t xml:space="preserve">ROS 2 | MediaPipe Hands | OpenCV | Jetson | Raspberry Pi 5 | DYNAMIXEL XL330 | React | </w:t>
+      </w:r>
+      <w:hyperlink r:id="rId13">
         <w:r>
           <w:rPr>
-            <w:rFonts w:ascii="Arial" w:cs="Arial" w:eastAsia="Arial" w:hAnsi="Arial"/>
-            <w:b w:val="0"/>
-            <w:bCs w:val="0"/>
-            <w:i w:val="0"/>
-            <w:iCs w:val="0"/>
-            <w:smallCaps w:val="0"/>
-            <w:strike w:val="0"/>
-            <w:color w:val="000000"/>
+            <w:rFonts w:ascii="Arial" w:hAnsi="Arial"/>
             <w:sz w:val="17"/>
             <w:szCs w:val="17"/>
+            <w:color w:val="000000"/>
             <w:u w:val="single"/>
-            <w:shd w:fill="auto" w:val="clear"/>
-            <w:vertAlign w:val="baseline"/>
-            <w:rtl w:val="0"/>
           </w:rPr>
-          <w:t xml:space="preserve">Repository</w:t>
+          <w:t>Case Study</w:t>
         </w:r>
       </w:hyperlink>
-      <w:r>
-        <w:rPr>
-          <w:rtl w:val="0"/>
-        </w:rPr>
-      </w:r>
     </w:p>
     <w:p>
       <w:pPr>
@@ -1291,22 +1199,12 @@
       </w:pPr>
       <w:r>
         <w:rPr>
-          <w:rFonts w:ascii="Arial" w:cs="Arial" w:eastAsia="Arial" w:hAnsi="Arial"/>
-          <w:b w:val="0"/>
-          <w:bCs w:val="0"/>
-          <w:i w:val="0"/>
-          <w:iCs w:val="0"/>
-          <w:smallCaps w:val="0"/>
-          <w:strike w:val="0"/>
-          <w:color w:val="000000"/>
-          <w:sz w:val="17"/>
-          <w:szCs w:val="17"/>
-          <w:u w:val="none"/>
-          <w:shd w:fill="auto" w:val="clear"/>
-          <w:vertAlign w:val="baseline"/>
-          <w:rtl w:val="0"/>
-        </w:rPr>
-        <w:t xml:space="preserve">Led full-stack and robot integration on a two-person team for a smart-factory system: RealSense + YOLOv5 inspection triggered conveyor stops and Dobot vacuum pick-and-place.</w:t>
+          <w:rFonts w:ascii="Arial" w:hAnsi="Arial"/>
+          <w:b w:val="0"/>
+          <w:i w:val="0"/>
+          <w:sz w:val="17"/>
+        </w:rPr>
+        <w:t>Team-built a human-mimetic tendon hand that maps 21 MediaPipe landmarks to a seven-axis HandCommand and drives seven DYNAMIXEL XL330 actuators through ROS 2.</w:t>
       </w:r>
     </w:p>
     <w:p>
@@ -1334,22 +1232,12 @@
       </w:pPr>
       <w:r>
         <w:rPr>
-          <w:rFonts w:ascii="Arial" w:cs="Arial" w:eastAsia="Arial" w:hAnsi="Arial"/>
-          <w:b w:val="0"/>
-          <w:bCs w:val="0"/>
-          <w:i w:val="0"/>
-          <w:iCs w:val="0"/>
-          <w:smallCaps w:val="0"/>
-          <w:strike w:val="0"/>
-          <w:color w:val="000000"/>
-          <w:sz w:val="17"/>
-          <w:szCs w:val="17"/>
-          <w:u w:val="none"/>
-          <w:shd w:fill="auto" w:val="clear"/>
-          <w:vertAlign w:val="baseline"/>
-          <w:rtl w:val="0"/>
-        </w:rPr>
-        <w:t xml:space="preserve">Built the RealOps dashboard, FastAPI REST/WebSocket services, ROS 2 bridge, device adapters, and LLM command integration for live monitoring and control.</w:t>
+          <w:rFonts w:ascii="Arial" w:hAnsi="Arial"/>
+          <w:b w:val="0"/>
+          <w:i w:val="0"/>
+          <w:sz w:val="17"/>
+        </w:rPr>
+        <w:t>Integrated Jetson perception, Raspberry Pi 5 command mediation, Command Guard and GPIO E-Stop, React monitoring, and rosbag2-to-EC2 experiment records.</w:t>
       </w:r>
     </w:p>
     <w:p>
@@ -1390,66 +1278,31 @@
       </w:pPr>
       <w:r>
         <w:rPr>
-          <w:rFonts w:ascii="Arial" w:cs="Arial" w:eastAsia="Arial" w:hAnsi="Arial"/>
-          <w:b w:val="1"/>
-          <w:bCs w:val="1"/>
-          <w:i w:val="0"/>
-          <w:iCs w:val="0"/>
-          <w:smallCaps w:val="0"/>
-          <w:strike w:val="0"/>
-          <w:color w:val="000000"/>
-          <w:sz w:val="18"/>
-          <w:szCs w:val="18"/>
-          <w:u w:val="none"/>
-          <w:shd w:fill="auto" w:val="clear"/>
-          <w:vertAlign w:val="baseline"/>
-          <w:rtl w:val="0"/>
-        </w:rPr>
-        <w:t xml:space="preserve">Briefit | AI-Based News Curation Service</w:t>
-      </w:r>
-      <w:r>
-        <w:rPr>
-          <w:rFonts w:ascii="Arial" w:cs="Arial" w:eastAsia="Arial" w:hAnsi="Arial"/>
-          <w:b w:val="0"/>
-          <w:bCs w:val="0"/>
-          <w:i w:val="0"/>
-          <w:iCs w:val="0"/>
-          <w:smallCaps w:val="0"/>
-          <w:strike w:val="0"/>
-          <w:color w:val="000000"/>
-          <w:sz w:val="18"/>
-          <w:szCs w:val="18"/>
-          <w:u w:val="none"/>
-          <w:shd w:fill="auto" w:val="clear"/>
-          <w:vertAlign w:val="baseline"/>
-          <w:rtl w:val="0"/>
-        </w:rPr>
-        <w:t xml:space="preserve"> | Team AI Engineer</w:t>
-      </w:r>
-      <w:r>
-        <w:rPr>
-          <w:rFonts w:ascii="Arial" w:cs="Arial" w:eastAsia="Arial" w:hAnsi="Arial"/>
-          <w:b w:val="1"/>
-          <w:bCs w:val="1"/>
-          <w:i w:val="0"/>
-          <w:iCs w:val="0"/>
-          <w:smallCaps w:val="0"/>
-          <w:strike w:val="0"/>
-          <w:color w:val="000000"/>
-          <w:sz w:val="17"/>
-          <w:szCs w:val="17"/>
-          <w:u w:val="none"/>
-          <w:shd w:fill="auto" w:val="clear"/>
-          <w:vertAlign w:val="baseline"/>
-          <w:rtl w:val="0"/>
+          <w:rFonts w:ascii="Arial" w:hAnsi="Arial"/>
+          <w:b/>
+          <w:i w:val="0"/>
+          <w:sz w:val="18"/>
+        </w:rPr>
+        <w:t>AQIS for Smart Factory</w:t>
+      </w:r>
+      <w:r>
+        <w:rPr>
+          <w:rFonts w:ascii="Arial" w:hAnsi="Arial"/>
+          <w:b w:val="0"/>
+          <w:i w:val="0"/>
+          <w:sz w:val="18"/>
+        </w:rPr>
+        <w:t xml:space="preserve"> | Team Lead, Full-Stack &amp; Robot Integration</w:t>
+      </w:r>
+      <w:r>
+        <w:rPr>
+          <w:rFonts w:ascii="Arial" w:hAnsi="Arial"/>
+          <w:b/>
+          <w:i w:val="0"/>
+          <w:sz w:val="17"/>
         </w:rPr>
         <w:tab/>
-        <w:t xml:space="preserve">May 2025 - Sep 2025</w:t>
-      </w:r>
-      <w:r>
-        <w:rPr>
-          <w:rtl w:val="0"/>
-        </w:rPr>
+        <w:t>May 2026 - Jun 2026</w:t>
       </w:r>
     </w:p>
     <w:p>
@@ -1487,49 +1340,25 @@
       </w:pPr>
       <w:r>
         <w:rPr>
-          <w:rFonts w:ascii="Arial" w:cs="Arial" w:eastAsia="Arial" w:hAnsi="Arial"/>
-          <w:b w:val="0"/>
-          <w:bCs w:val="0"/>
-          <w:i w:val="1"/>
-          <w:iCs w:val="1"/>
-          <w:smallCaps w:val="0"/>
-          <w:strike w:val="0"/>
-          <w:color w:val="000000"/>
-          <w:sz w:val="17"/>
-          <w:szCs w:val="17"/>
-          <w:u w:val="none"/>
-          <w:shd w:fill="auto" w:val="clear"/>
-          <w:vertAlign w:val="baseline"/>
-          <w:rtl w:val="0"/>
-        </w:rPr>
-        <w:t xml:space="preserve">Python | aiohttp | BeautifulSoup | Transformers | KoBART | </w:t>
-      </w:r>
-      <w:hyperlink r:id="rId10">
+          <w:rFonts w:ascii="Arial" w:hAnsi="Arial"/>
+          <w:b w:val="0"/>
+          <w:i/>
+          <w:sz w:val="17"/>
+        </w:rPr>
+        <w:t xml:space="preserve">ROS 2 | FastAPI | WebSocket | React | RealSense | Dobot | YOLOv5 | </w:t>
+      </w:r>
+      <w:hyperlink r:id="rId9">
         <w:r>
           <w:rPr>
-            <w:rFonts w:ascii="Arial" w:cs="Arial" w:eastAsia="Arial" w:hAnsi="Arial"/>
-            <w:b w:val="0"/>
-            <w:bCs w:val="0"/>
-            <w:i w:val="0"/>
-            <w:iCs w:val="0"/>
-            <w:smallCaps w:val="0"/>
-            <w:strike w:val="0"/>
-            <w:color w:val="000000"/>
+            <w:rFonts w:ascii="Arial" w:hAnsi="Arial"/>
             <w:sz w:val="17"/>
             <w:szCs w:val="17"/>
+            <w:color w:val="000000"/>
             <w:u w:val="single"/>
-            <w:shd w:fill="auto" w:val="clear"/>
-            <w:vertAlign w:val="baseline"/>
-            <w:rtl w:val="0"/>
           </w:rPr>
-          <w:t xml:space="preserve">Repository</w:t>
+          <w:t>Repository</w:t>
         </w:r>
       </w:hyperlink>
-      <w:r>
-        <w:rPr>
-          <w:rtl w:val="0"/>
-        </w:rPr>
-      </w:r>
     </w:p>
     <w:p>
       <w:pPr>
@@ -1556,22 +1385,12 @@
       </w:pPr>
       <w:r>
         <w:rPr>
-          <w:rFonts w:ascii="Arial" w:cs="Arial" w:eastAsia="Arial" w:hAnsi="Arial"/>
-          <w:b w:val="0"/>
-          <w:bCs w:val="0"/>
-          <w:i w:val="0"/>
-          <w:iCs w:val="0"/>
-          <w:smallCaps w:val="0"/>
-          <w:strike w:val="0"/>
-          <w:color w:val="000000"/>
-          <w:sz w:val="17"/>
-          <w:szCs w:val="17"/>
-          <w:u w:val="none"/>
-          <w:shd w:fill="auto" w:val="clear"/>
-          <w:vertAlign w:val="baseline"/>
-          <w:rtl w:val="0"/>
-        </w:rPr>
-        <w:t xml:space="preserve">Built an asynchronous multi-source news pipeline with similarity grouping and neutral article summarization.</w:t>
+          <w:rFonts w:ascii="Arial" w:hAnsi="Arial"/>
+          <w:b w:val="0"/>
+          <w:i w:val="0"/>
+          <w:sz w:val="17"/>
+        </w:rPr>
+        <w:t>Led full-stack and robot integration on a two-person team for a smart-factory system: RealSense + YOLOv5 inspection triggered conveyor stops and Dobot vacuum pick-and-place.</w:t>
       </w:r>
     </w:p>
     <w:p>
@@ -1599,22 +1418,12 @@
       </w:pPr>
       <w:r>
         <w:rPr>
-          <w:rFonts w:ascii="Arial" w:cs="Arial" w:eastAsia="Arial" w:hAnsi="Arial"/>
-          <w:b w:val="0"/>
-          <w:bCs w:val="0"/>
-          <w:i w:val="0"/>
-          <w:iCs w:val="0"/>
-          <w:smallCaps w:val="0"/>
-          <w:strike w:val="0"/>
-          <w:color w:val="000000"/>
-          <w:sz w:val="17"/>
-          <w:szCs w:val="17"/>
-          <w:u w:val="none"/>
-          <w:shd w:fill="auto" w:val="clear"/>
-          <w:vertAlign w:val="baseline"/>
-          <w:rtl w:val="0"/>
-        </w:rPr>
-        <w:t xml:space="preserve">Worked on crawling, preprocessing, tokenization, and KoBART summarization experiments across API- and local-model pipeline variants.</w:t>
+          <w:rFonts w:ascii="Arial" w:hAnsi="Arial"/>
+          <w:b w:val="0"/>
+          <w:i w:val="0"/>
+          <w:sz w:val="17"/>
+        </w:rPr>
+        <w:t>Built the RealOps dashboard, FastAPI REST/WebSocket services, ROS 2 bridge, device adapters, and LLM command integration for live monitoring and control.</w:t>
       </w:r>
     </w:p>
     <w:p>

</xml_diff>

<commit_message>
Refine portfolio identity and readability
</commit_message>
<xml_diff>
--- a/public/resume/SeMinKong-Resume.docx
+++ b/public/resume/SeMinKong-Resume.docx
@@ -48,7 +48,7 @@
           <w:szCs w:val="17"/>
           <w:rtl w:val="0"/>
         </w:rPr>
-        <w:t xml:space="preserve">AI | ROBOTICS | COMPUTER VISION</w:t>
+        <w:t>SOFTWARE | VISION | ROBOTICS</w:t>
       </w:r>
       <w:r>
         <w:rPr>
@@ -188,7 +188,7 @@
           <w:i w:val="0"/>
           <w:sz w:val="18"/>
         </w:rPr>
-        <w:t>Software engineering graduate focused on AI and robotics, with project experience integrating computer vision, ROS 2, backend services, and hardware. Recent team work includes THING, a human-mimetic robot hand connecting 21-point hand perception to guarded seven-axis actuation, live monitoring, and experiment records.</w:t>
+        <w:t>Software engineering graduate who enjoys learning new technologies and turning ideas into working systems. Project experience spans computer vision, ROS 2, backend services, and hardware integration, with a focus on clear interfaces, observable behavior, and end-to-end implementation.</w:t>
       </w:r>
     </w:p>
     <w:p>
@@ -1116,7 +1116,7 @@
           <w:sz w:val="17"/>
         </w:rPr>
         <w:tab/>
-        <w:t>2026</w:t>
+        <w:t>Jul 2026 - Aug 2026</w:t>
       </w:r>
     </w:p>
     <w:p>

</xml_diff>

<commit_message>
feat: add verified resume award evidence
</commit_message>
<xml_diff>
--- a/public/resume/SeMinKong-Resume.docx
+++ b/public/resume/SeMinKong-Resume.docx
@@ -2047,75 +2047,43 @@
       </w:pPr>
       <w:r>
         <w:rPr>
-          <w:rFonts w:ascii="Arial" w:cs="Arial" w:eastAsia="Arial" w:hAnsi="Arial"/>
-          <w:b w:val="1"/>
-          <w:bCs w:val="1"/>
-          <w:i w:val="0"/>
-          <w:iCs w:val="0"/>
-          <w:smallCaps w:val="0"/>
-          <w:strike w:val="0"/>
-          <w:color w:val="000000"/>
-          <w:sz w:val="18"/>
-          <w:szCs w:val="18"/>
-          <w:u w:val="none"/>
-          <w:shd w:fill="auto" w:val="clear"/>
-          <w:vertAlign w:val="baseline"/>
-          <w:rtl w:val="0"/>
-        </w:rPr>
-        <w:t xml:space="preserve">2025 IT Project Pro League - Encouragement Award</w:t>
-      </w:r>
-      <w:r>
-        <w:rPr>
-          <w:rFonts w:ascii="Arial" w:cs="Arial" w:eastAsia="Arial" w:hAnsi="Arial"/>
-          <w:b w:val="0"/>
-          <w:bCs w:val="0"/>
-          <w:i w:val="0"/>
-          <w:iCs w:val="0"/>
-          <w:smallCaps w:val="0"/>
-          <w:strike w:val="0"/>
-          <w:color w:val="000000"/>
-          <w:sz w:val="18"/>
-          <w:szCs w:val="18"/>
-          <w:u w:val="none"/>
-          <w:shd w:fill="auto" w:val="clear"/>
-          <w:vertAlign w:val="baseline"/>
-          <w:rtl w:val="0"/>
-        </w:rPr>
-        <w:t xml:space="preserve"> | Soongsil University Spartan SW Education Center</w:t>
-      </w:r>
-      <w:r>
-        <w:rPr>
-          <w:b w:val="1"/>
-          <w:bCs w:val="1"/>
-          <w:sz w:val="17"/>
-          <w:szCs w:val="17"/>
-          <w:rtl w:val="0"/>
+          <w:rFonts w:ascii="Arial" w:hAnsi="Arial" w:eastAsia="Arial" w:cs="Arial"/>
+          <w:b/>
+          <w:i w:val="0"/>
+          <w:sz w:val="18"/>
+          <w:u w:val="none"/>
+        </w:rPr>
+        <w:t>SSAFY Common Project - Excellence Award</w:t>
+      </w:r>
+      <w:r>
+        <w:rPr>
+          <w:rFonts w:ascii="Arial" w:hAnsi="Arial" w:eastAsia="Arial" w:cs="Arial"/>
+          <w:b w:val="0"/>
+          <w:i w:val="0"/>
+          <w:sz w:val="18"/>
+          <w:u w:val="none"/>
+        </w:rPr>
+        <w:t xml:space="preserve"> | AIoT Track, Gwangju Class 1 (1st Place)</w:t>
+      </w:r>
+      <w:r>
+        <w:rPr>
+          <w:rFonts w:ascii="Arial" w:hAnsi="Arial" w:eastAsia="Arial" w:cs="Arial"/>
+          <w:b/>
+          <w:i w:val="0"/>
+          <w:sz w:val="17"/>
+          <w:u w:val="none"/>
         </w:rPr>
         <w:tab/>
       </w:r>
       <w:r>
         <w:rPr>
-          <w:rFonts w:ascii="Arial" w:cs="Arial" w:eastAsia="Arial" w:hAnsi="Arial"/>
-          <w:b w:val="1"/>
-          <w:bCs w:val="1"/>
-          <w:i w:val="0"/>
-          <w:iCs w:val="0"/>
-          <w:smallCaps w:val="0"/>
-          <w:strike w:val="0"/>
-          <w:color w:val="000000"/>
-          <w:sz w:val="17"/>
-          <w:szCs w:val="17"/>
-          <w:u w:val="none"/>
-          <w:shd w:fill="auto" w:val="clear"/>
-          <w:vertAlign w:val="baseline"/>
-          <w:rtl w:val="0"/>
-        </w:rPr>
-        <w:t xml:space="preserve">22 Nov 2025</w:t>
-      </w:r>
-      <w:r>
-        <w:rPr>
-          <w:rtl w:val="0"/>
-        </w:rPr>
+          <w:rFonts w:ascii="Arial" w:hAnsi="Arial" w:eastAsia="Arial" w:cs="Arial"/>
+          <w:b/>
+          <w:i w:val="0"/>
+          <w:sz w:val="17"/>
+          <w:u w:val="none"/>
+        </w:rPr>
+        <w:t>10 Aug 2026</w:t>
       </w:r>
     </w:p>
     <w:p>
@@ -2156,52 +2124,43 @@
       </w:pPr>
       <w:r>
         <w:rPr>
-          <w:rFonts w:ascii="Arial" w:cs="Arial" w:eastAsia="Arial" w:hAnsi="Arial"/>
-          <w:b w:val="1"/>
-          <w:bCs w:val="1"/>
-          <w:i w:val="0"/>
-          <w:iCs w:val="0"/>
-          <w:smallCaps w:val="0"/>
-          <w:strike w:val="0"/>
-          <w:color w:val="000000"/>
-          <w:sz w:val="18"/>
-          <w:szCs w:val="18"/>
-          <w:u w:val="none"/>
-          <w:shd w:fill="auto" w:val="clear"/>
-          <w:vertAlign w:val="baseline"/>
-          <w:rtl w:val="0"/>
-        </w:rPr>
-        <w:t xml:space="preserve">Software Competition - Gold Prize </w:t>
-      </w:r>
-      <w:r>
-        <w:rPr>
-          <w:rtl w:val="0"/>
-        </w:rPr>
-        <w:t xml:space="preserve">| Soongsil University SW</w:t>
-      </w:r>
-      <w:r>
-        <w:rPr>
-          <w:rFonts w:ascii="Arial" w:cs="Arial" w:eastAsia="Arial" w:hAnsi="Arial"/>
-          <w:b w:val="1"/>
-          <w:bCs w:val="1"/>
-          <w:i w:val="0"/>
-          <w:iCs w:val="0"/>
-          <w:smallCaps w:val="0"/>
-          <w:strike w:val="0"/>
-          <w:color w:val="000000"/>
-          <w:sz w:val="17"/>
-          <w:szCs w:val="17"/>
-          <w:u w:val="none"/>
-          <w:shd w:fill="auto" w:val="clear"/>
-          <w:vertAlign w:val="baseline"/>
-          <w:rtl w:val="0"/>
+          <w:rFonts w:ascii="Arial" w:hAnsi="Arial" w:eastAsia="Arial" w:cs="Arial"/>
+          <w:b/>
+          <w:i w:val="0"/>
+          <w:sz w:val="18"/>
+          <w:u w:val="none"/>
+        </w:rPr>
+        <w:t>2025 IT Project Pro League - Encouragement Award</w:t>
+      </w:r>
+      <w:r>
+        <w:rPr>
+          <w:rFonts w:ascii="Arial" w:hAnsi="Arial" w:eastAsia="Arial" w:cs="Arial"/>
+          <w:b w:val="0"/>
+          <w:i w:val="0"/>
+          <w:sz w:val="18"/>
+          <w:u w:val="none"/>
+        </w:rPr>
+        <w:t xml:space="preserve"> | Soongsil University Spartan SW Education Center</w:t>
+      </w:r>
+      <w:r>
+        <w:rPr>
+          <w:rFonts w:ascii="Arial" w:hAnsi="Arial" w:eastAsia="Arial" w:cs="Arial"/>
+          <w:b/>
+          <w:i w:val="0"/>
+          <w:sz w:val="17"/>
+          <w:u w:val="none"/>
         </w:rPr>
         <w:tab/>
       </w:r>
       <w:r>
         <w:rPr>
-          <w:rtl w:val="0"/>
-        </w:rPr>
+          <w:rFonts w:ascii="Arial" w:hAnsi="Arial" w:eastAsia="Arial" w:cs="Arial"/>
+          <w:b/>
+          <w:i w:val="0"/>
+          <w:sz w:val="17"/>
+          <w:u w:val="none"/>
+        </w:rPr>
+        <w:t>22 Nov 2025</w:t>
       </w:r>
     </w:p>
     <w:p>
@@ -2242,9 +2201,69 @@
       </w:pPr>
       <w:r>
         <w:rPr>
-          <w:rFonts w:ascii="Arial" w:cs="Arial" w:eastAsia="Arial" w:hAnsi="Arial"/>
-          <w:b w:val="1"/>
-          <w:bCs w:val="1"/>
+          <w:rFonts w:ascii="Arial" w:hAnsi="Arial" w:eastAsia="Arial" w:cs="Arial"/>
+          <w:b/>
+          <w:i w:val="0"/>
+          <w:sz w:val="18"/>
+          <w:u w:val="none"/>
+        </w:rPr>
+        <w:t>2025 College of IT Software Competition - Gold Prize</w:t>
+      </w:r>
+      <w:r>
+        <w:rPr>
+          <w:rFonts w:ascii="Arial" w:hAnsi="Arial" w:eastAsia="Arial" w:cs="Arial"/>
+          <w:b w:val="0"/>
+          <w:i w:val="0"/>
+          <w:sz w:val="18"/>
+          <w:u w:val="none"/>
+        </w:rPr>
+        <w:t xml:space="preserve"> | Soongsil University College of IT</w:t>
+      </w:r>
+      <w:r>
+        <w:rPr>
+          <w:rFonts w:ascii="Arial" w:hAnsi="Arial" w:eastAsia="Arial" w:cs="Arial"/>
+          <w:b/>
+          <w:i w:val="0"/>
+          <w:sz w:val="17"/>
+          <w:u w:val="none"/>
+        </w:rPr>
+        <w:tab/>
+      </w:r>
+      <w:r>
+        <w:rPr>
+          <w:rFonts w:ascii="Arial" w:hAnsi="Arial" w:eastAsia="Arial" w:cs="Arial"/>
+          <w:b/>
+          <w:i w:val="0"/>
+          <w:sz w:val="17"/>
+          <w:u w:val="none"/>
+        </w:rPr>
+        <w:t>18 Aug 2025</w:t>
+      </w:r>
+    </w:p>
+    <w:p>
+      <w:pPr>
+        <w:keepNext w:val="1"/>
+        <w:keepLines w:val="1"/>
+        <w:pageBreakBefore w:val="0"/>
+        <w:widowControl w:val="1"/>
+        <w:pBdr>
+          <w:top w:space="0" w:sz="0" w:val="nil"/>
+          <w:left w:space="0" w:sz="0" w:val="nil"/>
+          <w:bottom w:space="0" w:sz="0" w:val="nil"/>
+          <w:right w:space="0" w:sz="0" w:val="nil"/>
+          <w:between w:space="0" w:sz="0" w:val="nil"/>
+        </w:pBdr>
+        <w:shd w:fill="auto" w:val="clear"/>
+        <w:tabs>
+          <w:tab w:val="right" w:leader="none" w:pos="10178"/>
+        </w:tabs>
+        <w:spacing w:after="14" w:before="0" w:line="240" w:lineRule="auto"/>
+        <w:ind w:left="0" w:right="0" w:firstLine="0"/>
+        <w:jc w:val="left"/>
+        <w:rPr>
+          <w:rFonts w:ascii="Arial" w:cs="Arial" w:eastAsia="Arial" w:hAnsi="Arial"/>
+          <w:b w:val="0"/>
+          <w:bCs w:val="0"/>
           <w:i w:val="0"/>
           <w:iCs w:val="0"/>
           <w:smallCaps w:val="0"/>
@@ -2255,39 +2274,47 @@
           <w:u w:val="none"/>
           <w:shd w:fill="auto" w:val="clear"/>
           <w:vertAlign w:val="baseline"/>
-          <w:rtl w:val="0"/>
-        </w:rPr>
-        <w:t xml:space="preserve">Capstone Design Competition - Encouragement Award </w:t>
-      </w:r>
-      <w:r>
-        <w:rPr>
-          <w:rtl w:val="0"/>
-        </w:rPr>
-        <w:t xml:space="preserve">| Soongsil University SW</w:t>
-      </w:r>
-      <w:r>
-        <w:rPr>
-          <w:rFonts w:ascii="Arial" w:cs="Arial" w:eastAsia="Arial" w:hAnsi="Arial"/>
-          <w:b w:val="1"/>
-          <w:bCs w:val="1"/>
-          <w:i w:val="0"/>
-          <w:iCs w:val="0"/>
-          <w:smallCaps w:val="0"/>
-          <w:strike w:val="0"/>
-          <w:color w:val="000000"/>
-          <w:sz w:val="17"/>
-          <w:szCs w:val="17"/>
-          <w:u w:val="none"/>
-          <w:shd w:fill="auto" w:val="clear"/>
-          <w:vertAlign w:val="baseline"/>
-          <w:rtl w:val="0"/>
+        </w:rPr>
+      </w:pPr>
+      <w:r>
+        <w:rPr>
+          <w:rFonts w:ascii="Arial" w:hAnsi="Arial" w:eastAsia="Arial" w:cs="Arial"/>
+          <w:b/>
+          <w:i w:val="0"/>
+          <w:sz w:val="18"/>
+          <w:u w:val="none"/>
+        </w:rPr>
+        <w:t>15th Soongsil Capstone Design Competition - Encouragement Award</w:t>
+      </w:r>
+      <w:r>
+        <w:rPr>
+          <w:rFonts w:ascii="Arial" w:hAnsi="Arial" w:eastAsia="Arial" w:cs="Arial"/>
+          <w:b w:val="0"/>
+          <w:i w:val="0"/>
+          <w:sz w:val="18"/>
+          <w:u w:val="none"/>
+        </w:rPr>
+        <w:t xml:space="preserve"> | Soongsil University</w:t>
+      </w:r>
+      <w:r>
+        <w:rPr>
+          <w:rFonts w:ascii="Arial" w:hAnsi="Arial" w:eastAsia="Arial" w:cs="Arial"/>
+          <w:b/>
+          <w:i w:val="0"/>
+          <w:sz w:val="17"/>
+          <w:u w:val="none"/>
         </w:rPr>
         <w:tab/>
       </w:r>
       <w:r>
         <w:rPr>
-          <w:rtl w:val="0"/>
-        </w:rPr>
+          <w:rFonts w:ascii="Arial" w:hAnsi="Arial" w:eastAsia="Arial" w:cs="Arial"/>
+          <w:b/>
+          <w:i w:val="0"/>
+          <w:sz w:val="17"/>
+          <w:u w:val="none"/>
+        </w:rPr>
+        <w:t>1 Oct 2025</w:t>
       </w:r>
     </w:p>
     <w:p>

</xml_diff>

<commit_message>
feat(resume): add Engineer Information Processing and OPIc proof images
Redacted certificate images for both credentials, resume DOCX/PDF/preview regenerated, and the portfolio label simplified.

Co-Authored-By: Claude Opus 5 <noreply@anthropic.com>

Claude-Session: https://claude.ai/code/session_018heWcVWU6J9aMa89UbrwnG
</commit_message>
<xml_diff>
--- a/public/resume/SeMinKong-Resume.docx
+++ b/public/resume/SeMinKong-Resume.docx
@@ -1051,7 +1051,7 @@
           <w:vertAlign w:val="baseline"/>
           <w:rtl w:val="0"/>
         </w:rPr>
-        <w:t xml:space="preserve">SELECTED PROJECTS</w:t>
+        <w:t>PROJECTS</w:t>
       </w:r>
     </w:p>
     <w:p>
@@ -2315,6 +2315,83 @@
           <w:u w:val="none"/>
         </w:rPr>
         <w:t>1 Oct 2025</w:t>
+      </w:r>
+    </w:p>
+    <w:p>
+      <w:pPr>
+        <w:keepNext w:val="1"/>
+        <w:keepLines w:val="1"/>
+        <w:pageBreakBefore w:val="0"/>
+        <w:widowControl w:val="1"/>
+        <w:pBdr>
+          <w:top w:space="0" w:sz="0" w:val="nil"/>
+          <w:left w:space="0" w:sz="0" w:val="nil"/>
+          <w:bottom w:space="0" w:sz="0" w:val="nil"/>
+          <w:right w:space="0" w:sz="0" w:val="nil"/>
+          <w:between w:space="0" w:sz="0" w:val="nil"/>
+        </w:pBdr>
+        <w:shd w:fill="auto" w:val="clear"/>
+        <w:tabs>
+          <w:tab w:val="right" w:leader="none" w:pos="10178"/>
+        </w:tabs>
+        <w:spacing w:after="14" w:before="0" w:line="240" w:lineRule="auto"/>
+        <w:ind w:left="0" w:right="0" w:firstLine="0"/>
+        <w:jc w:val="left"/>
+        <w:rPr>
+          <w:rFonts w:ascii="Arial" w:cs="Arial" w:eastAsia="Arial" w:hAnsi="Arial"/>
+          <w:b w:val="0"/>
+          <w:bCs w:val="0"/>
+          <w:i w:val="0"/>
+          <w:iCs w:val="0"/>
+          <w:smallCaps w:val="0"/>
+          <w:strike w:val="0"/>
+          <w:color w:val="000000"/>
+          <w:sz w:val="18"/>
+          <w:szCs w:val="18"/>
+          <w:u w:val="none"/>
+          <w:shd w:fill="auto" w:val="clear"/>
+          <w:vertAlign w:val="baseline"/>
+        </w:rPr>
+      </w:pPr>
+      <w:r>
+        <w:rPr>
+          <w:rFonts w:ascii="Arial" w:hAnsi="Arial" w:eastAsia="Arial" w:cs="Arial"/>
+          <w:b/>
+          <w:i w:val="0"/>
+          <w:sz w:val="18"/>
+          <w:u w:val="none"/>
+        </w:rPr>
+        <w:t>Engineer Information Processing (정보처리기사)</w:t>
+      </w:r>
+      <w:r>
+        <w:rPr>
+          <w:rFonts w:ascii="Arial" w:hAnsi="Arial" w:eastAsia="Arial" w:cs="Arial"/>
+          <w:b w:val="0"/>
+          <w:i w:val="0"/>
+          <w:sz w:val="18"/>
+          <w:u w:val="none"/>
+        </w:rPr>
+        <w:t xml:space="preserve"> | National Technical Qualification, Ministry of Science and ICT</w:t>
+      </w:r>
+      <w:r>
+        <w:rPr>
+          <w:rFonts w:ascii="Arial" w:hAnsi="Arial" w:eastAsia="Arial" w:cs="Arial"/>
+          <w:b/>
+          <w:i w:val="0"/>
+          <w:sz w:val="17"/>
+          <w:u w:val="none"/>
+        </w:rPr>
+        <w:tab/>
+      </w:r>
+      <w:r>
+        <w:rPr>
+          <w:rFonts w:ascii="Arial" w:hAnsi="Arial" w:eastAsia="Arial" w:cs="Arial"/>
+          <w:b/>
+          <w:i w:val="0"/>
+          <w:sz w:val="17"/>
+          <w:u w:val="none"/>
+        </w:rPr>
+        <w:t>11 Sep 2026</w:t>
       </w:r>
     </w:p>
     <w:p>

</xml_diff>